<commit_message>
Revamp CySA+ courseware to v8 — CS0-003 domain-ordered, in-depth theory, labs in per-lab folders
- Slides v8 (919 slides): full theory migrated from the legacy deck and reordered
  to the four CS0-003 exam domains; exam domains shown up front; an in-depth
  2-4 sentence explanation authored for every CySA+ concept; practice exam and
  CompTIA CySA+ exam registration (Pearson VUE) sections at the end.
- Learner Guide & Lesson Plan v2.1: Table of Contents, 11pt house body, Goal/Test-it
  boxes per lab, Word tables, corrected 9:30-6:30 / 1-hour-lunch 5-day schedule.
- Each lab now lives in its own folder (labs/lab-NN-*/README.md).
- Added Tertiary Infotech browser tools (simulator, ethical-hacking, fauxbank,
  crypto toolkit, IP calculator, PCAP analyzer, regex generator) to relevant labs.
- Confidential assessments and third-party references excluded from the repo.
</commit_message>
<xml_diff>
--- a/courseware/LP-CompTIA Cybersecurity Analyst (CySA+) Training.docx
+++ b/courseware/LP-CompTIA Cybersecurity Analyst (CySA+) Training.docx
@@ -194,7 +194,7 @@
           <w:color w:val="1F6FEB"/>
           <w:sz w:val="24"/>
         </w:rPr>
-        <w:t>Version 1.0</w:t>
+        <w:t>Version 2.1</w:t>
       </w:r>
     </w:p>
     <w:p>
@@ -366,11 +366,306 @@
           </w:p>
         </w:tc>
       </w:tr>
+      <w:tr>
+        <w:tc>
+          <w:tcPr>
+            <w:tcW w:type="dxa" w:w="1152"/>
+          </w:tcPr>
+          <w:p>
+            <w:r/>
+            <w:r>
+              <w:rPr>
+                <w:rFonts w:ascii="Arial" w:hAnsi="Arial"/>
+                <w:color w:val="161B26"/>
+                <w:sz w:val="19"/>
+              </w:rPr>
+              <w:t>2.0</w:t>
+            </w:r>
+          </w:p>
+        </w:tc>
+        <w:tc>
+          <w:tcPr>
+            <w:tcW w:type="dxa" w:w="1728"/>
+          </w:tcPr>
+          <w:p>
+            <w:r/>
+            <w:r>
+              <w:rPr>
+                <w:rFonts w:ascii="Arial" w:hAnsi="Arial"/>
+                <w:color w:val="161B26"/>
+                <w:sz w:val="19"/>
+              </w:rPr>
+              <w:t>18 Aug 2026</w:t>
+            </w:r>
+          </w:p>
+        </w:tc>
+        <w:tc>
+          <w:tcPr>
+            <w:tcW w:type="dxa" w:w="5184"/>
+          </w:tcPr>
+          <w:p>
+            <w:r/>
+            <w:r>
+              <w:rPr>
+                <w:rFonts w:ascii="Arial" w:hAnsi="Arial"/>
+                <w:color w:val="161B26"/>
+                <w:sz w:val="19"/>
+              </w:rPr>
+              <w:t>Second edition — courseware updated to v7 Slides: full theory content from the legacy deck reordered to the four CS0-003 exam domains, exam domains shown up front, practice exam and CompTIA CySA+ exam registration added at the end.</w:t>
+            </w:r>
+          </w:p>
+        </w:tc>
+        <w:tc>
+          <w:tcPr>
+            <w:tcW w:type="dxa" w:w="2016"/>
+          </w:tcPr>
+          <w:p>
+            <w:r/>
+            <w:r>
+              <w:rPr>
+                <w:rFonts w:ascii="Arial" w:hAnsi="Arial"/>
+                <w:color w:val="161B26"/>
+                <w:sz w:val="19"/>
+              </w:rPr>
+              <w:t>Tertiary Infotech Academy Pte Ltd</w:t>
+            </w:r>
+          </w:p>
+        </w:tc>
+      </w:tr>
+      <w:tr>
+        <w:tc>
+          <w:tcPr>
+            <w:tcW w:type="dxa" w:w="1152"/>
+          </w:tcPr>
+          <w:p>
+            <w:r/>
+            <w:r>
+              <w:rPr>
+                <w:rFonts w:ascii="Arial" w:hAnsi="Arial"/>
+                <w:color w:val="161B26"/>
+                <w:sz w:val="19"/>
+              </w:rPr>
+              <w:t>2.1</w:t>
+            </w:r>
+          </w:p>
+        </w:tc>
+        <w:tc>
+          <w:tcPr>
+            <w:tcW w:type="dxa" w:w="1728"/>
+          </w:tcPr>
+          <w:p>
+            <w:r/>
+            <w:r>
+              <w:rPr>
+                <w:rFonts w:ascii="Arial" w:hAnsi="Arial"/>
+                <w:color w:val="161B26"/>
+                <w:sz w:val="19"/>
+              </w:rPr>
+              <w:t>18 Aug 2026</w:t>
+            </w:r>
+          </w:p>
+        </w:tc>
+        <w:tc>
+          <w:tcPr>
+            <w:tcW w:type="dxa" w:w="5184"/>
+          </w:tcPr>
+          <w:p>
+            <w:r/>
+            <w:r>
+              <w:rPr>
+                <w:rFonts w:ascii="Arial" w:hAnsi="Arial"/>
+                <w:color w:val="161B26"/>
+                <w:sz w:val="19"/>
+              </w:rPr>
+              <w:t>House-format fixes — daily schedule corrected to 9:30am-6:30pm with a 1-hour lunch (8 instructional hours/day), theory-delivery rows added per day, slide-reference summary corrected, Table of Contents and 11pt body applied.</w:t>
+            </w:r>
+          </w:p>
+        </w:tc>
+        <w:tc>
+          <w:tcPr>
+            <w:tcW w:type="dxa" w:w="2016"/>
+          </w:tcPr>
+          <w:p>
+            <w:r/>
+            <w:r>
+              <w:rPr>
+                <w:rFonts w:ascii="Arial" w:hAnsi="Arial"/>
+                <w:color w:val="161B26"/>
+                <w:sz w:val="19"/>
+              </w:rPr>
+              <w:t>Tertiary Infotech Academy Pte Ltd</w:t>
+            </w:r>
+          </w:p>
+        </w:tc>
+      </w:tr>
     </w:tbl>
     <w:p>
       <w:pPr>
         <w:spacing w:after="80"/>
       </w:pPr>
+    </w:p>
+    <w:p>
+      <w:r>
+        <w:br w:type="page"/>
+      </w:r>
+    </w:p>
+    <w:p>
+      <w:pPr>
+        <w:pStyle w:val="Heading1"/>
+      </w:pPr>
+      <w:r>
+        <w:rPr>
+          <w:rFonts w:ascii="Arial" w:hAnsi="Arial"/>
+        </w:rPr>
+        <w:t>Table of Contents</w:t>
+      </w:r>
+    </w:p>
+    <w:p>
+      <w:r>
+        <w:fldChar w:fldCharType="begin"/>
+        <w:instrText xml:space="preserve">TOC \o "1-3" \h \z \u</w:instrText>
+        <w:fldChar w:fldCharType="separate"/>
+      </w:r>
+    </w:p>
+    <w:p>
+      <w:pPr>
+        <w:spacing w:after="40"/>
+        <w:ind w:left="0"/>
+      </w:pPr>
+      <w:r>
+        <w:rPr>
+          <w:rFonts w:ascii="Arial" w:hAnsi="Arial"/>
+          <w:b/>
+          <w:color w:val="161B26"/>
+          <w:sz w:val="22"/>
+        </w:rPr>
+        <w:t>Course Details</w:t>
+      </w:r>
+    </w:p>
+    <w:p>
+      <w:pPr>
+        <w:spacing w:after="40"/>
+        <w:ind w:left="0"/>
+      </w:pPr>
+      <w:r>
+        <w:rPr>
+          <w:rFonts w:ascii="Arial" w:hAnsi="Arial"/>
+          <w:b/>
+          <w:color w:val="161B26"/>
+          <w:sz w:val="22"/>
+        </w:rPr>
+        <w:t>Course Overview</w:t>
+      </w:r>
+    </w:p>
+    <w:p>
+      <w:pPr>
+        <w:spacing w:after="40"/>
+        <w:ind w:left="0"/>
+      </w:pPr>
+      <w:r>
+        <w:rPr>
+          <w:rFonts w:ascii="Arial" w:hAnsi="Arial"/>
+          <w:b/>
+          <w:color w:val="161B26"/>
+          <w:sz w:val="22"/>
+        </w:rPr>
+        <w:t>Learning Outcomes</w:t>
+      </w:r>
+    </w:p>
+    <w:p>
+      <w:pPr>
+        <w:spacing w:after="40"/>
+        <w:ind w:left="0"/>
+      </w:pPr>
+      <w:r>
+        <w:rPr>
+          <w:rFonts w:ascii="Arial" w:hAnsi="Arial"/>
+          <w:b/>
+          <w:color w:val="161B26"/>
+          <w:sz w:val="22"/>
+        </w:rPr>
+        <w:t>Day 1</w:t>
+      </w:r>
+    </w:p>
+    <w:p>
+      <w:pPr>
+        <w:spacing w:after="40"/>
+        <w:ind w:left="0"/>
+      </w:pPr>
+      <w:r>
+        <w:rPr>
+          <w:rFonts w:ascii="Arial" w:hAnsi="Arial"/>
+          <w:b/>
+          <w:color w:val="161B26"/>
+          <w:sz w:val="22"/>
+        </w:rPr>
+        <w:t>Day 2</w:t>
+      </w:r>
+    </w:p>
+    <w:p>
+      <w:pPr>
+        <w:spacing w:after="40"/>
+        <w:ind w:left="0"/>
+      </w:pPr>
+      <w:r>
+        <w:rPr>
+          <w:rFonts w:ascii="Arial" w:hAnsi="Arial"/>
+          <w:b/>
+          <w:color w:val="161B26"/>
+          <w:sz w:val="22"/>
+        </w:rPr>
+        <w:t>Day 3</w:t>
+      </w:r>
+    </w:p>
+    <w:p>
+      <w:pPr>
+        <w:spacing w:after="40"/>
+        <w:ind w:left="0"/>
+      </w:pPr>
+      <w:r>
+        <w:rPr>
+          <w:rFonts w:ascii="Arial" w:hAnsi="Arial"/>
+          <w:b/>
+          <w:color w:val="161B26"/>
+          <w:sz w:val="22"/>
+        </w:rPr>
+        <w:t>Day 4</w:t>
+      </w:r>
+    </w:p>
+    <w:p>
+      <w:pPr>
+        <w:spacing w:after="40"/>
+        <w:ind w:left="0"/>
+      </w:pPr>
+      <w:r>
+        <w:rPr>
+          <w:rFonts w:ascii="Arial" w:hAnsi="Arial"/>
+          <w:b/>
+          <w:color w:val="161B26"/>
+          <w:sz w:val="22"/>
+        </w:rPr>
+        <w:t>Day 5</w:t>
+      </w:r>
+    </w:p>
+    <w:p>
+      <w:pPr>
+        <w:spacing w:after="40"/>
+        <w:ind w:left="0"/>
+      </w:pPr>
+      <w:r>
+        <w:rPr>
+          <w:rFonts w:ascii="Arial" w:hAnsi="Arial"/>
+          <w:b/>
+          <w:color w:val="161B26"/>
+          <w:sz w:val="22"/>
+        </w:rPr>
+        <w:t>Slide Reference Summary</w:t>
+      </w:r>
+    </w:p>
+    <w:p>
+      <w:r>
+        <w:fldChar w:fldCharType="end"/>
+      </w:r>
     </w:p>
     <w:p>
       <w:r>
@@ -612,7 +907,7 @@
                 <w:color w:val="161B26"/>
                 <w:sz w:val="19"/>
               </w:rPr>
-              <w:t>9:00 AM – 6:00 PM (8 training hours/day, excluding lunch)</w:t>
+              <w:t>9:30 AM – 6:30 PM (8 instructional hours/day)</w:t>
             </w:r>
           </w:p>
         </w:tc>
@@ -648,7 +943,7 @@
                 <w:color w:val="161B26"/>
                 <w:sz w:val="19"/>
               </w:rPr>
-              <w:t>12:30 PM – 1:15 PM (45 minutes)</w:t>
+              <w:t>1:00 PM – 2:00 PM (1 hour)</w:t>
             </w:r>
           </w:p>
         </w:tc>
@@ -828,7 +1123,7 @@
                 <w:color w:val="161B26"/>
                 <w:sz w:val="19"/>
               </w:rPr>
-              <w:t>CompTIA Cybersecurity Analyst (CySA+) Training-v6.pptx (172 slides)</w:t>
+              <w:t>CompTIA Cybersecurity Analyst (CySA+) Training-v8.pptx (919 slides)</w:t>
             </w:r>
           </w:p>
         </w:tc>
@@ -874,7 +1169,7 @@
           <w:rFonts w:ascii="Arial" w:hAnsi="Arial"/>
           <w:b w:val="0"/>
           <w:i w:val="0"/>
-          <w:sz w:val="21"/>
+          <w:sz w:val="22"/>
         </w:rPr>
         <w:t>This 5-day hands-on course develops practical cybersecurity analyst skills aligned to the CompTIA CySA+ CS0-003 exam. Across four domains — Security Operations, Vulnerability Management, Incident Response, and Reporting &amp; Communication — learners complete 30 step-by-step labs using the free Killercoda playground and free industry tools, culminating in a written and case-study assessment.</w:t>
       </w:r>
@@ -899,7 +1194,7 @@
           <w:rFonts w:ascii="Arial" w:hAnsi="Arial"/>
           <w:b/>
           <w:i w:val="0"/>
-          <w:sz w:val="21"/>
+          <w:sz w:val="22"/>
         </w:rPr>
         <w:t>By the end of this course, participants will be able to:</w:t>
       </w:r>
@@ -912,7 +1207,7 @@
         <w:rPr>
           <w:rFonts w:ascii="Arial" w:hAnsi="Arial"/>
           <w:color w:val="161B26"/>
-          <w:sz w:val="21"/>
+          <w:sz w:val="22"/>
         </w:rPr>
         <w:t>Identify cyber security risks, threats, and vulnerabilities, and assess their impact on the organization.</w:t>
       </w:r>
@@ -925,7 +1220,7 @@
         <w:rPr>
           <w:rFonts w:ascii="Arial" w:hAnsi="Arial"/>
           <w:color w:val="161B26"/>
-          <w:sz w:val="21"/>
+          <w:sz w:val="22"/>
         </w:rPr>
         <w:t>Develop cyber risk assessments by consolidating insights from business to identify security gaps.</w:t>
       </w:r>
@@ -938,7 +1233,7 @@
         <w:rPr>
           <w:rFonts w:ascii="Arial" w:hAnsi="Arial"/>
           <w:color w:val="161B26"/>
-          <w:sz w:val="21"/>
+          <w:sz w:val="22"/>
         </w:rPr>
         <w:t>Identify possible treatments for identified cyber risks, threats, and vulnerabilities.</w:t>
       </w:r>
@@ -951,7 +1246,7 @@
         <w:rPr>
           <w:rFonts w:ascii="Arial" w:hAnsi="Arial"/>
           <w:color w:val="161B26"/>
-          <w:sz w:val="21"/>
+          <w:sz w:val="22"/>
         </w:rPr>
         <w:t>Implement endorsed treatment measures to address security gaps and ensure data protection.</w:t>
       </w:r>
@@ -982,7 +1277,7 @@
           <w:b w:val="0"/>
           <w:i/>
           <w:color w:val="5B6372"/>
-          <w:sz w:val="21"/>
+          <w:sz w:val="22"/>
         </w:rPr>
         <w:t>Topic 1: Security Operations</w:t>
       </w:r>
@@ -997,9 +1292,9 @@
           <w:b/>
           <w:i w:val="0"/>
           <w:color w:val="1F6FEB"/>
-          <w:sz w:val="21"/>
+          <w:sz w:val="22"/>
         </w:rPr>
-        <w:t>Morning Session  ·  9:00 AM – 12:30 PM</w:t>
+        <w:t>Morning Session  ·  9:30 AM – 1:00 PM</w:t>
       </w:r>
     </w:p>
     <w:tbl>
@@ -1101,7 +1396,7 @@
                 <w:color w:val="161B26"/>
                 <w:sz w:val="18"/>
               </w:rPr>
-              <w:t>9:00 – 9:20</w:t>
+              <w:t>9:30 – 9:50</w:t>
             </w:r>
           </w:p>
         </w:tc>
@@ -1149,7 +1444,7 @@
                 <w:color w:val="161B26"/>
                 <w:sz w:val="18"/>
               </w:rPr>
-              <w:t>1–5</w:t>
+              <w:t>2–7</w:t>
             </w:r>
           </w:p>
         </w:tc>
@@ -1167,7 +1462,7 @@
                 <w:color w:val="161B26"/>
                 <w:sz w:val="18"/>
               </w:rPr>
-              <w:t>9:20 – 9:55</w:t>
+              <w:t>9:50 – 10:30</w:t>
             </w:r>
           </w:p>
         </w:tc>
@@ -1183,7 +1478,7 @@
                 <w:color w:val="161B26"/>
                 <w:sz w:val="18"/>
               </w:rPr>
-              <w:t>Lesson Plan; Learning Outcomes; Skills Framework; Course Outline</w:t>
+              <w:t>Lesson Plan; Skills Framework; Learning Outcomes; CS0-003 Exam Domains; Course Outline</w:t>
             </w:r>
           </w:p>
         </w:tc>
@@ -1199,7 +1494,7 @@
                 <w:color w:val="161B26"/>
                 <w:sz w:val="18"/>
               </w:rPr>
-              <w:t>35 min</w:t>
+              <w:t>40 min</w:t>
             </w:r>
           </w:p>
         </w:tc>
@@ -1215,7 +1510,7 @@
                 <w:color w:val="161B26"/>
                 <w:sz w:val="18"/>
               </w:rPr>
-              <w:t>6–19</w:t>
+              <w:t>9–19</w:t>
             </w:r>
           </w:p>
         </w:tc>
@@ -1233,7 +1528,7 @@
                 <w:color w:val="161B26"/>
                 <w:sz w:val="18"/>
               </w:rPr>
-              <w:t>9:55 – 10:15</w:t>
+              <w:t>10:30 – 10:45</w:t>
             </w:r>
           </w:p>
         </w:tc>
@@ -1249,7 +1544,7 @@
                 <w:color w:val="161B26"/>
                 <w:sz w:val="18"/>
               </w:rPr>
-              <w:t>Final Assessment Briefing; Criteria for Funding; LMS/TMS</w:t>
+              <w:t>Briefing for Assessment; Assessment; Criteria for Funding</w:t>
             </w:r>
           </w:p>
         </w:tc>
@@ -1265,7 +1560,7 @@
                 <w:color w:val="161B26"/>
                 <w:sz w:val="18"/>
               </w:rPr>
-              <w:t>20 min</w:t>
+              <w:t>15 min</w:t>
             </w:r>
           </w:p>
         </w:tc>
@@ -1281,7 +1576,7 @@
                 <w:color w:val="161B26"/>
                 <w:sz w:val="18"/>
               </w:rPr>
-              <w:t>20–22</w:t>
+              <w:t>20–23</w:t>
             </w:r>
           </w:p>
         </w:tc>
@@ -1301,7 +1596,7 @@
                 <w:color w:val="5B6372"/>
                 <w:sz w:val="18"/>
               </w:rPr>
-              <w:t>10:15 – 10:30</w:t>
+              <w:t>10:45 – 11:00</w:t>
             </w:r>
           </w:p>
         </w:tc>
@@ -1428,7 +1723,7 @@
                 <w:color w:val="1F6FEB"/>
                 <w:sz w:val="18"/>
               </w:rPr>
-              <w:t>23–24</w:t>
+              <w:t>24–25</w:t>
             </w:r>
           </w:p>
         </w:tc>
@@ -1446,7 +1741,7 @@
                 <w:color w:val="161B26"/>
                 <w:sz w:val="18"/>
               </w:rPr>
-              <w:t>10:30 – 12:30</w:t>
+              <w:t>11:00 – 1:00</w:t>
             </w:r>
           </w:p>
         </w:tc>
@@ -1462,7 +1757,7 @@
                 <w:color w:val="161B26"/>
                 <w:sz w:val="18"/>
               </w:rPr>
-              <w:t>Lab 1: Log Ingestion and Time Synchronization; Lab 2: OS Hardening and System Process Inspection; Lab 3: Network Segmentation and Zero Trust; Lab 4: Detecting Malicious Network Activity; Lab 5: Host-Based IOC Hunting</w:t>
+              <w:t>Theory: Security Operations concepts</w:t>
             </w:r>
           </w:p>
         </w:tc>
@@ -1494,7 +1789,7 @@
                 <w:color w:val="161B26"/>
                 <w:sz w:val="18"/>
               </w:rPr>
-              <w:t>25–47</w:t>
+              <w:t>26–269</w:t>
             </w:r>
           </w:p>
         </w:tc>
@@ -1514,7 +1809,7 @@
                 <w:color w:val="5B6372"/>
                 <w:sz w:val="18"/>
               </w:rPr>
-              <w:t>12:30 – 1:15</w:t>
+              <w:t>1:00 – 2:00</w:t>
             </w:r>
           </w:p>
         </w:tc>
@@ -1550,7 +1845,7 @@
                 <w:color w:val="5B6372"/>
                 <w:sz w:val="18"/>
               </w:rPr>
-              <w:t>45 min</w:t>
+              <w:t>60 min</w:t>
             </w:r>
           </w:p>
         </w:tc>
@@ -1589,9 +1884,9 @@
           <w:b/>
           <w:i w:val="0"/>
           <w:color w:val="1F6FEB"/>
-          <w:sz w:val="21"/>
+          <w:sz w:val="22"/>
         </w:rPr>
-        <w:t>Afternoon Session  ·  1:15 PM – 6:00 PM</w:t>
+        <w:t>Afternoon Session  ·  2:00 PM – 6:30 PM</w:t>
       </w:r>
     </w:p>
     <w:tbl>
@@ -1693,7 +1988,7 @@
                 <w:color w:val="161B26"/>
                 <w:sz w:val="18"/>
               </w:rPr>
-              <w:t>1:15 – 1:20</w:t>
+              <w:t>2:00 – 2:05</w:t>
             </w:r>
           </w:p>
         </w:tc>
@@ -1750,6 +2045,79 @@
         <w:tc>
           <w:tcPr>
             <w:tcW w:type="dxa" w:w="1656"/>
+            <w:shd w:val="clear" w:fill="EAF1FD"/>
+          </w:tcPr>
+          <w:p>
+            <w:r/>
+            <w:r>
+              <w:rPr>
+                <w:rFonts w:ascii="Arial" w:hAnsi="Arial"/>
+                <w:b/>
+                <w:color w:val="1F6FEB"/>
+                <w:sz w:val="18"/>
+              </w:rPr>
+            </w:r>
+          </w:p>
+        </w:tc>
+        <w:tc>
+          <w:tcPr>
+            <w:tcW w:type="dxa" w:w="5040"/>
+            <w:shd w:val="clear" w:fill="EAF1FD"/>
+          </w:tcPr>
+          <w:p>
+            <w:r/>
+            <w:r>
+              <w:rPr>
+                <w:rFonts w:ascii="Arial" w:hAnsi="Arial"/>
+                <w:b/>
+                <w:color w:val="1F6FEB"/>
+                <w:sz w:val="18"/>
+              </w:rPr>
+              <w:t>Hands-On Labs 1–10</w:t>
+            </w:r>
+          </w:p>
+        </w:tc>
+        <w:tc>
+          <w:tcPr>
+            <w:tcW w:type="dxa" w:w="1224"/>
+            <w:shd w:val="clear" w:fill="EAF1FD"/>
+          </w:tcPr>
+          <w:p>
+            <w:r/>
+            <w:r>
+              <w:rPr>
+                <w:rFonts w:ascii="Arial" w:hAnsi="Arial"/>
+                <w:b/>
+                <w:color w:val="1F6FEB"/>
+                <w:sz w:val="18"/>
+              </w:rPr>
+              <w:t>—</w:t>
+            </w:r>
+          </w:p>
+        </w:tc>
+        <w:tc>
+          <w:tcPr>
+            <w:tcW w:type="dxa" w:w="1296"/>
+            <w:shd w:val="clear" w:fill="EAF1FD"/>
+          </w:tcPr>
+          <w:p>
+            <w:r/>
+            <w:r>
+              <w:rPr>
+                <w:rFonts w:ascii="Arial" w:hAnsi="Arial"/>
+                <w:b/>
+                <w:color w:val="1F6FEB"/>
+                <w:sz w:val="18"/>
+              </w:rPr>
+              <w:t>270–316</w:t>
+            </w:r>
+          </w:p>
+        </w:tc>
+      </w:tr>
+      <w:tr>
+        <w:tc>
+          <w:tcPr>
+            <w:tcW w:type="dxa" w:w="1656"/>
           </w:tcPr>
           <w:p>
             <w:r/>
@@ -1759,7 +2127,7 @@
                 <w:color w:val="161B26"/>
                 <w:sz w:val="18"/>
               </w:rPr>
-              <w:t>1:20 – 3:30</w:t>
+              <w:t>2:05 – 4:00</w:t>
             </w:r>
           </w:p>
         </w:tc>
@@ -1775,7 +2143,7 @@
                 <w:color w:val="161B26"/>
                 <w:sz w:val="18"/>
               </w:rPr>
-              <w:t>Lab 6: Packet Capture for Threat Hunting; Lab 7: SIEM Log Correlation; Lab 8: Email Header Analysis (SPF/DKIM/DMARC)</w:t>
+              <w:t>Lab 1: Log Ingestion and Time Synchronization; Lab 2: OS Hardening and System Process Inspection; Lab 3: Network Segmentation and Zero Trust; Lab 4: Detecting Malicious Network Activity; Lab 5: Host-Based IOC Hunting</w:t>
             </w:r>
           </w:p>
         </w:tc>
@@ -1791,7 +2159,7 @@
                 <w:color w:val="161B26"/>
                 <w:sz w:val="18"/>
               </w:rPr>
-              <w:t>130 min</w:t>
+              <w:t>115 min</w:t>
             </w:r>
           </w:p>
         </w:tc>
@@ -1807,7 +2175,7 @@
                 <w:color w:val="161B26"/>
                 <w:sz w:val="18"/>
               </w:rPr>
-              <w:t>48–60</w:t>
+              <w:t>270–292</w:t>
             </w:r>
           </w:p>
         </w:tc>
@@ -1827,7 +2195,7 @@
                 <w:color w:val="5B6372"/>
                 <w:sz w:val="18"/>
               </w:rPr>
-              <w:t>3:30 – 3:45</w:t>
+              <w:t>4:00 – 4:15</w:t>
             </w:r>
           </w:p>
         </w:tc>
@@ -1899,7 +2267,7 @@
                 <w:color w:val="161B26"/>
                 <w:sz w:val="18"/>
               </w:rPr>
-              <w:t>3:45 – 6:00</w:t>
+              <w:t>4:15 – 6:25</w:t>
             </w:r>
           </w:p>
         </w:tc>
@@ -1915,7 +2283,7 @@
                 <w:color w:val="161B26"/>
                 <w:sz w:val="18"/>
               </w:rPr>
-              <w:t>Lab 9: Malware Triage with Hashing and VirusTotal; Lab 10: Threat Intelligence and MITRE ATT&amp;CK</w:t>
+              <w:t>Lab 6: Packet Capture for Threat Hunting; Lab 7: SIEM Log Correlation; Lab 8: Email Header Analysis (SPF/DKIM/DMARC); Lab 9: Malware Triage with Hashing and VirusTotal; Lab 10: Threat Intelligence and MITRE ATT&amp;CK</w:t>
             </w:r>
           </w:p>
         </w:tc>
@@ -1931,7 +2299,7 @@
                 <w:color w:val="161B26"/>
                 <w:sz w:val="18"/>
               </w:rPr>
-              <w:t>135 min</w:t>
+              <w:t>130 min</w:t>
             </w:r>
           </w:p>
         </w:tc>
@@ -1947,7 +2315,7 @@
                 <w:color w:val="161B26"/>
                 <w:sz w:val="18"/>
               </w:rPr>
-              <w:t>61–70</w:t>
+              <w:t>293–316</w:t>
             </w:r>
           </w:p>
         </w:tc>
@@ -1965,7 +2333,73 @@
                 <w:color w:val="161B26"/>
                 <w:sz w:val="18"/>
               </w:rPr>
-              <w:t>6:00</w:t>
+              <w:t>6:25 – 6:30</w:t>
+            </w:r>
+          </w:p>
+        </w:tc>
+        <w:tc>
+          <w:tcPr>
+            <w:tcW w:type="dxa" w:w="5040"/>
+          </w:tcPr>
+          <w:p>
+            <w:r/>
+            <w:r>
+              <w:rPr>
+                <w:rFonts w:ascii="Arial" w:hAnsi="Arial"/>
+                <w:color w:val="161B26"/>
+                <w:sz w:val="18"/>
+              </w:rPr>
+              <w:t>Day 1 Recap; Q&amp;A</w:t>
+            </w:r>
+          </w:p>
+        </w:tc>
+        <w:tc>
+          <w:tcPr>
+            <w:tcW w:type="dxa" w:w="1224"/>
+          </w:tcPr>
+          <w:p>
+            <w:r/>
+            <w:r>
+              <w:rPr>
+                <w:rFonts w:ascii="Arial" w:hAnsi="Arial"/>
+                <w:color w:val="161B26"/>
+                <w:sz w:val="18"/>
+              </w:rPr>
+              <w:t>5 min</w:t>
+            </w:r>
+          </w:p>
+        </w:tc>
+        <w:tc>
+          <w:tcPr>
+            <w:tcW w:type="dxa" w:w="1296"/>
+          </w:tcPr>
+          <w:p>
+            <w:r/>
+            <w:r>
+              <w:rPr>
+                <w:rFonts w:ascii="Arial" w:hAnsi="Arial"/>
+                <w:color w:val="161B26"/>
+                <w:sz w:val="18"/>
+              </w:rPr>
+              <w:t>311–316</w:t>
+            </w:r>
+          </w:p>
+        </w:tc>
+      </w:tr>
+      <w:tr>
+        <w:tc>
+          <w:tcPr>
+            <w:tcW w:type="dxa" w:w="1656"/>
+          </w:tcPr>
+          <w:p>
+            <w:r/>
+            <w:r>
+              <w:rPr>
+                <w:rFonts w:ascii="Arial" w:hAnsi="Arial"/>
+                <w:color w:val="161B26"/>
+                <w:sz w:val="18"/>
+              </w:rPr>
+              <w:t>6:30</w:t>
             </w:r>
           </w:p>
         </w:tc>
@@ -2050,7 +2484,7 @@
           <w:b w:val="0"/>
           <w:i/>
           <w:color w:val="5B6372"/>
-          <w:sz w:val="21"/>
+          <w:sz w:val="22"/>
         </w:rPr>
         <w:t>Topic 2: Vulnerability Management</w:t>
       </w:r>
@@ -2065,9 +2499,9 @@
           <w:b/>
           <w:i w:val="0"/>
           <w:color w:val="1F6FEB"/>
-          <w:sz w:val="21"/>
+          <w:sz w:val="22"/>
         </w:rPr>
-        <w:t>Morning Session  ·  9:00 AM – 12:30 PM</w:t>
+        <w:t>Morning Session  ·  9:30 AM – 1:00 PM</w:t>
       </w:r>
     </w:p>
     <w:tbl>
@@ -2169,7 +2603,7 @@
                 <w:color w:val="161B26"/>
                 <w:sz w:val="18"/>
               </w:rPr>
-              <w:t>9:00 – 9:10</w:t>
+              <w:t>9:30 – 9:40</w:t>
             </w:r>
           </w:p>
         </w:tc>
@@ -2290,7 +2724,7 @@
                 <w:color w:val="1F6FEB"/>
                 <w:sz w:val="18"/>
               </w:rPr>
-              <w:t>71–72</w:t>
+              <w:t>317–318</w:t>
             </w:r>
           </w:p>
         </w:tc>
@@ -2308,7 +2742,7 @@
                 <w:color w:val="161B26"/>
                 <w:sz w:val="18"/>
               </w:rPr>
-              <w:t>9:10 – 10:30</w:t>
+              <w:t>9:40 – 10:45</w:t>
             </w:r>
           </w:p>
         </w:tc>
@@ -2324,7 +2758,7 @@
                 <w:color w:val="161B26"/>
                 <w:sz w:val="18"/>
               </w:rPr>
-              <w:t>Lab 11: Asset Discovery with Nmap; Lab 12: Vulnerability Scanning with OpenVAS (Greenbone CE); Lab 13: Web App Scanning with OWASP ZAP</w:t>
+              <w:t>Theory: Vulnerability Management concepts (part 1)</w:t>
             </w:r>
           </w:p>
         </w:tc>
@@ -2340,7 +2774,7 @@
                 <w:color w:val="161B26"/>
                 <w:sz w:val="18"/>
               </w:rPr>
-              <w:t>80 min</w:t>
+              <w:t>65 min</w:t>
             </w:r>
           </w:p>
         </w:tc>
@@ -2356,7 +2790,7 @@
                 <w:color w:val="161B26"/>
                 <w:sz w:val="18"/>
               </w:rPr>
-              <w:t>73–86</w:t>
+              <w:t>319–452</w:t>
             </w:r>
           </w:p>
         </w:tc>
@@ -2376,7 +2810,7 @@
                 <w:color w:val="5B6372"/>
                 <w:sz w:val="18"/>
               </w:rPr>
-              <w:t>10:30 – 10:45</w:t>
+              <w:t>10:45 – 11:00</w:t>
             </w:r>
           </w:p>
         </w:tc>
@@ -2448,7 +2882,7 @@
                 <w:color w:val="161B26"/>
                 <w:sz w:val="18"/>
               </w:rPr>
-              <w:t>10:45 – 12:30</w:t>
+              <w:t>11:00 – 1:00</w:t>
             </w:r>
           </w:p>
         </w:tc>
@@ -2464,7 +2898,7 @@
                 <w:color w:val="161B26"/>
                 <w:sz w:val="18"/>
               </w:rPr>
-              <w:t>Lab 14: Web Recon with Nikto and Burp Suite; Lab 15: Metasploit Framework Basics</w:t>
+              <w:t>Theory: Vulnerability Management concepts (part 2)</w:t>
             </w:r>
           </w:p>
         </w:tc>
@@ -2480,7 +2914,7 @@
                 <w:color w:val="161B26"/>
                 <w:sz w:val="18"/>
               </w:rPr>
-              <w:t>105 min</w:t>
+              <w:t>120 min</w:t>
             </w:r>
           </w:p>
         </w:tc>
@@ -2496,7 +2930,7 @@
                 <w:color w:val="161B26"/>
                 <w:sz w:val="18"/>
               </w:rPr>
-              <w:t>87–95</w:t>
+              <w:t>453–585</w:t>
             </w:r>
           </w:p>
         </w:tc>
@@ -2516,7 +2950,7 @@
                 <w:color w:val="5B6372"/>
                 <w:sz w:val="18"/>
               </w:rPr>
-              <w:t>12:30 – 1:15</w:t>
+              <w:t>1:00 – 2:00</w:t>
             </w:r>
           </w:p>
         </w:tc>
@@ -2552,7 +2986,7 @@
                 <w:color w:val="5B6372"/>
                 <w:sz w:val="18"/>
               </w:rPr>
-              <w:t>45 min</w:t>
+              <w:t>60 min</w:t>
             </w:r>
           </w:p>
         </w:tc>
@@ -2591,9 +3025,9 @@
           <w:b/>
           <w:i w:val="0"/>
           <w:color w:val="1F6FEB"/>
-          <w:sz w:val="21"/>
+          <w:sz w:val="22"/>
         </w:rPr>
-        <w:t>Afternoon Session  ·  1:15 PM – 6:00 PM</w:t>
+        <w:t>Afternoon Session  ·  2:00 PM – 6:30 PM</w:t>
       </w:r>
     </w:p>
     <w:tbl>
@@ -2695,7 +3129,7 @@
                 <w:color w:val="161B26"/>
                 <w:sz w:val="18"/>
               </w:rPr>
-              <w:t>1:15 – 1:20</w:t>
+              <w:t>2:00 – 2:05</w:t>
             </w:r>
           </w:p>
         </w:tc>
@@ -2752,6 +3186,79 @@
         <w:tc>
           <w:tcPr>
             <w:tcW w:type="dxa" w:w="1656"/>
+            <w:shd w:val="clear" w:fill="EAF1FD"/>
+          </w:tcPr>
+          <w:p>
+            <w:r/>
+            <w:r>
+              <w:rPr>
+                <w:rFonts w:ascii="Arial" w:hAnsi="Arial"/>
+                <w:b/>
+                <w:color w:val="1F6FEB"/>
+                <w:sz w:val="18"/>
+              </w:rPr>
+            </w:r>
+          </w:p>
+        </w:tc>
+        <w:tc>
+          <w:tcPr>
+            <w:tcW w:type="dxa" w:w="5040"/>
+            <w:shd w:val="clear" w:fill="EAF1FD"/>
+          </w:tcPr>
+          <w:p>
+            <w:r/>
+            <w:r>
+              <w:rPr>
+                <w:rFonts w:ascii="Arial" w:hAnsi="Arial"/>
+                <w:b/>
+                <w:color w:val="1F6FEB"/>
+                <w:sz w:val="18"/>
+              </w:rPr>
+              <w:t>Hands-On Labs 11–19</w:t>
+            </w:r>
+          </w:p>
+        </w:tc>
+        <w:tc>
+          <w:tcPr>
+            <w:tcW w:type="dxa" w:w="1224"/>
+            <w:shd w:val="clear" w:fill="EAF1FD"/>
+          </w:tcPr>
+          <w:p>
+            <w:r/>
+            <w:r>
+              <w:rPr>
+                <w:rFonts w:ascii="Arial" w:hAnsi="Arial"/>
+                <w:b/>
+                <w:color w:val="1F6FEB"/>
+                <w:sz w:val="18"/>
+              </w:rPr>
+              <w:t>—</w:t>
+            </w:r>
+          </w:p>
+        </w:tc>
+        <w:tc>
+          <w:tcPr>
+            <w:tcW w:type="dxa" w:w="1296"/>
+            <w:shd w:val="clear" w:fill="EAF1FD"/>
+          </w:tcPr>
+          <w:p>
+            <w:r/>
+            <w:r>
+              <w:rPr>
+                <w:rFonts w:ascii="Arial" w:hAnsi="Arial"/>
+                <w:b/>
+                <w:color w:val="1F6FEB"/>
+                <w:sz w:val="18"/>
+              </w:rPr>
+              <w:t>586–626</w:t>
+            </w:r>
+          </w:p>
+        </w:tc>
+      </w:tr>
+      <w:tr>
+        <w:tc>
+          <w:tcPr>
+            <w:tcW w:type="dxa" w:w="1656"/>
           </w:tcPr>
           <w:p>
             <w:r/>
@@ -2761,7 +3268,7 @@
                 <w:color w:val="161B26"/>
                 <w:sz w:val="18"/>
               </w:rPr>
-              <w:t>1:20 – 3:30</w:t>
+              <w:t>2:05 – 4:00</w:t>
             </w:r>
           </w:p>
         </w:tc>
@@ -2777,7 +3284,7 @@
                 <w:color w:val="161B26"/>
                 <w:sz w:val="18"/>
               </w:rPr>
-              <w:t>Lab 16: CVSS Scoring and Prioritization; Lab 17: Exploiting and Mitigating XSS and SQL Injection</w:t>
+              <w:t>Lab 11: Asset Discovery with Nmap; Lab 12: Vulnerability Scanning with OpenVAS (Greenbone CE); Lab 13: Web App Scanning with OWASP ZAP; Lab 14: Web Recon with Nikto and Burp Suite; Lab 15: Metasploit Framework Basics</w:t>
             </w:r>
           </w:p>
         </w:tc>
@@ -2793,7 +3300,7 @@
                 <w:color w:val="161B26"/>
                 <w:sz w:val="18"/>
               </w:rPr>
-              <w:t>130 min</w:t>
+              <w:t>115 min</w:t>
             </w:r>
           </w:p>
         </w:tc>
@@ -2809,7 +3316,7 @@
                 <w:color w:val="161B26"/>
                 <w:sz w:val="18"/>
               </w:rPr>
-              <w:t>96–104</w:t>
+              <w:t>586–608</w:t>
             </w:r>
           </w:p>
         </w:tc>
@@ -2829,7 +3336,7 @@
                 <w:color w:val="5B6372"/>
                 <w:sz w:val="18"/>
               </w:rPr>
-              <w:t>3:30 – 3:45</w:t>
+              <w:t>4:00 – 4:15</w:t>
             </w:r>
           </w:p>
         </w:tc>
@@ -2901,7 +3408,7 @@
                 <w:color w:val="161B26"/>
                 <w:sz w:val="18"/>
               </w:rPr>
-              <w:t>3:45 – 6:00</w:t>
+              <w:t>4:15 – 6:25</w:t>
             </w:r>
           </w:p>
         </w:tc>
@@ -2917,7 +3424,7 @@
                 <w:color w:val="161B26"/>
                 <w:sz w:val="18"/>
               </w:rPr>
-              <w:t>Lab 18: Patch Management and Hardening; Lab 19: Attack Surface Reconnaissance</w:t>
+              <w:t>Lab 16: CVSS Scoring and Prioritization; Lab 17: Exploiting and Mitigating XSS and SQL Injection; Lab 18: Patch Management and Hardening; Lab 19: Attack Surface Reconnaissance</w:t>
             </w:r>
           </w:p>
         </w:tc>
@@ -2933,7 +3440,7 @@
                 <w:color w:val="161B26"/>
                 <w:sz w:val="18"/>
               </w:rPr>
-              <w:t>135 min</w:t>
+              <w:t>130 min</w:t>
             </w:r>
           </w:p>
         </w:tc>
@@ -2949,7 +3456,7 @@
                 <w:color w:val="161B26"/>
                 <w:sz w:val="18"/>
               </w:rPr>
-              <w:t>105–112</w:t>
+              <w:t>609–626</w:t>
             </w:r>
           </w:p>
         </w:tc>
@@ -2967,7 +3474,73 @@
                 <w:color w:val="161B26"/>
                 <w:sz w:val="18"/>
               </w:rPr>
-              <w:t>6:00</w:t>
+              <w:t>6:25 – 6:30</w:t>
+            </w:r>
+          </w:p>
+        </w:tc>
+        <w:tc>
+          <w:tcPr>
+            <w:tcW w:type="dxa" w:w="5040"/>
+          </w:tcPr>
+          <w:p>
+            <w:r/>
+            <w:r>
+              <w:rPr>
+                <w:rFonts w:ascii="Arial" w:hAnsi="Arial"/>
+                <w:color w:val="161B26"/>
+                <w:sz w:val="18"/>
+              </w:rPr>
+              <w:t>Day 2 Recap; Q&amp;A</w:t>
+            </w:r>
+          </w:p>
+        </w:tc>
+        <w:tc>
+          <w:tcPr>
+            <w:tcW w:type="dxa" w:w="1224"/>
+          </w:tcPr>
+          <w:p>
+            <w:r/>
+            <w:r>
+              <w:rPr>
+                <w:rFonts w:ascii="Arial" w:hAnsi="Arial"/>
+                <w:color w:val="161B26"/>
+                <w:sz w:val="18"/>
+              </w:rPr>
+              <w:t>5 min</w:t>
+            </w:r>
+          </w:p>
+        </w:tc>
+        <w:tc>
+          <w:tcPr>
+            <w:tcW w:type="dxa" w:w="1296"/>
+          </w:tcPr>
+          <w:p>
+            <w:r/>
+            <w:r>
+              <w:rPr>
+                <w:rFonts w:ascii="Arial" w:hAnsi="Arial"/>
+                <w:color w:val="161B26"/>
+                <w:sz w:val="18"/>
+              </w:rPr>
+              <w:t>622–626</w:t>
+            </w:r>
+          </w:p>
+        </w:tc>
+      </w:tr>
+      <w:tr>
+        <w:tc>
+          <w:tcPr>
+            <w:tcW w:type="dxa" w:w="1656"/>
+          </w:tcPr>
+          <w:p>
+            <w:r/>
+            <w:r>
+              <w:rPr>
+                <w:rFonts w:ascii="Arial" w:hAnsi="Arial"/>
+                <w:color w:val="161B26"/>
+                <w:sz w:val="18"/>
+              </w:rPr>
+              <w:t>6:30</w:t>
             </w:r>
           </w:p>
         </w:tc>
@@ -3052,7 +3625,7 @@
           <w:b w:val="0"/>
           <w:i/>
           <w:color w:val="5B6372"/>
-          <w:sz w:val="21"/>
+          <w:sz w:val="22"/>
         </w:rPr>
         <w:t>Topic 3: Incident Response and Management</w:t>
       </w:r>
@@ -3067,9 +3640,9 @@
           <w:b/>
           <w:i w:val="0"/>
           <w:color w:val="1F6FEB"/>
-          <w:sz w:val="21"/>
+          <w:sz w:val="22"/>
         </w:rPr>
-        <w:t>Morning Session  ·  9:00 AM – 12:30 PM</w:t>
+        <w:t>Morning Session  ·  9:30 AM – 1:00 PM</w:t>
       </w:r>
     </w:p>
     <w:tbl>
@@ -3171,7 +3744,7 @@
                 <w:color w:val="161B26"/>
                 <w:sz w:val="18"/>
               </w:rPr>
-              <w:t>9:00 – 9:10</w:t>
+              <w:t>9:30 – 9:40</w:t>
             </w:r>
           </w:p>
         </w:tc>
@@ -3292,7 +3865,7 @@
                 <w:color w:val="1F6FEB"/>
                 <w:sz w:val="18"/>
               </w:rPr>
-              <w:t>113–114</w:t>
+              <w:t>627–628</w:t>
             </w:r>
           </w:p>
         </w:tc>
@@ -3310,7 +3883,7 @@
                 <w:color w:val="161B26"/>
                 <w:sz w:val="18"/>
               </w:rPr>
-              <w:t>9:10 – 10:30</w:t>
+              <w:t>9:40 – 10:45</w:t>
             </w:r>
           </w:p>
         </w:tc>
@@ -3326,7 +3899,7 @@
                 <w:color w:val="161B26"/>
                 <w:sz w:val="18"/>
               </w:rPr>
-              <w:t>Lab 20: Cyber Kill Chain and ATT&amp;CK Mapping; Lab 21: Evidence Acquisition and Chain of Custody</w:t>
+              <w:t>Theory: Incident Response and Management concepts (part 1)</w:t>
             </w:r>
           </w:p>
         </w:tc>
@@ -3342,7 +3915,7 @@
                 <w:color w:val="161B26"/>
                 <w:sz w:val="18"/>
               </w:rPr>
-              <w:t>80 min</w:t>
+              <w:t>65 min</w:t>
             </w:r>
           </w:p>
         </w:tc>
@@ -3358,7 +3931,7 @@
                 <w:color w:val="161B26"/>
                 <w:sz w:val="18"/>
               </w:rPr>
-              <w:t>115–124</w:t>
+              <w:t>629–678</w:t>
             </w:r>
           </w:p>
         </w:tc>
@@ -3378,7 +3951,7 @@
                 <w:color w:val="5B6372"/>
                 <w:sz w:val="18"/>
               </w:rPr>
-              <w:t>10:30 – 10:45</w:t>
+              <w:t>10:45 – 11:00</w:t>
             </w:r>
           </w:p>
         </w:tc>
@@ -3450,7 +4023,7 @@
                 <w:color w:val="161B26"/>
                 <w:sz w:val="18"/>
               </w:rPr>
-              <w:t>10:45 – 12:30</w:t>
+              <w:t>11:00 – 1:00</w:t>
             </w:r>
           </w:p>
         </w:tc>
@@ -3466,7 +4039,7 @@
                 <w:color w:val="161B26"/>
                 <w:sz w:val="18"/>
               </w:rPr>
-              <w:t>Lab 22: Memory Forensics with Volatility</w:t>
+              <w:t>Theory: Incident Response and Management concepts (part 2)</w:t>
             </w:r>
           </w:p>
         </w:tc>
@@ -3482,7 +4055,7 @@
                 <w:color w:val="161B26"/>
                 <w:sz w:val="18"/>
               </w:rPr>
-              <w:t>105 min</w:t>
+              <w:t>120 min</w:t>
             </w:r>
           </w:p>
         </w:tc>
@@ -3498,7 +4071,7 @@
                 <w:color w:val="161B26"/>
                 <w:sz w:val="18"/>
               </w:rPr>
-              <w:t>125–129</w:t>
+              <w:t>679–727</w:t>
             </w:r>
           </w:p>
         </w:tc>
@@ -3518,7 +4091,7 @@
                 <w:color w:val="5B6372"/>
                 <w:sz w:val="18"/>
               </w:rPr>
-              <w:t>12:30 – 1:15</w:t>
+              <w:t>1:00 – 2:00</w:t>
             </w:r>
           </w:p>
         </w:tc>
@@ -3554,7 +4127,7 @@
                 <w:color w:val="5B6372"/>
                 <w:sz w:val="18"/>
               </w:rPr>
-              <w:t>45 min</w:t>
+              <w:t>60 min</w:t>
             </w:r>
           </w:p>
         </w:tc>
@@ -3593,9 +4166,9 @@
           <w:b/>
           <w:i w:val="0"/>
           <w:color w:val="1F6FEB"/>
-          <w:sz w:val="21"/>
+          <w:sz w:val="22"/>
         </w:rPr>
-        <w:t>Afternoon Session  ·  1:15 PM – 6:00 PM</w:t>
+        <w:t>Afternoon Session  ·  2:00 PM – 6:30 PM</w:t>
       </w:r>
     </w:p>
     <w:tbl>
@@ -3697,7 +4270,7 @@
                 <w:color w:val="161B26"/>
                 <w:sz w:val="18"/>
               </w:rPr>
-              <w:t>1:15 – 1:20</w:t>
+              <w:t>2:00 – 2:05</w:t>
             </w:r>
           </w:p>
         </w:tc>
@@ -3754,6 +4327,79 @@
         <w:tc>
           <w:tcPr>
             <w:tcW w:type="dxa" w:w="1656"/>
+            <w:shd w:val="clear" w:fill="EAF1FD"/>
+          </w:tcPr>
+          <w:p>
+            <w:r/>
+            <w:r>
+              <w:rPr>
+                <w:rFonts w:ascii="Arial" w:hAnsi="Arial"/>
+                <w:b/>
+                <w:color w:val="1F6FEB"/>
+                <w:sz w:val="18"/>
+              </w:rPr>
+            </w:r>
+          </w:p>
+        </w:tc>
+        <w:tc>
+          <w:tcPr>
+            <w:tcW w:type="dxa" w:w="5040"/>
+            <w:shd w:val="clear" w:fill="EAF1FD"/>
+          </w:tcPr>
+          <w:p>
+            <w:r/>
+            <w:r>
+              <w:rPr>
+                <w:rFonts w:ascii="Arial" w:hAnsi="Arial"/>
+                <w:b/>
+                <w:color w:val="1F6FEB"/>
+                <w:sz w:val="18"/>
+              </w:rPr>
+              <w:t>Hands-On Labs 20–25</w:t>
+            </w:r>
+          </w:p>
+        </w:tc>
+        <w:tc>
+          <w:tcPr>
+            <w:tcW w:type="dxa" w:w="1224"/>
+            <w:shd w:val="clear" w:fill="EAF1FD"/>
+          </w:tcPr>
+          <w:p>
+            <w:r/>
+            <w:r>
+              <w:rPr>
+                <w:rFonts w:ascii="Arial" w:hAnsi="Arial"/>
+                <w:b/>
+                <w:color w:val="1F6FEB"/>
+                <w:sz w:val="18"/>
+              </w:rPr>
+              <w:t>—</w:t>
+            </w:r>
+          </w:p>
+        </w:tc>
+        <w:tc>
+          <w:tcPr>
+            <w:tcW w:type="dxa" w:w="1296"/>
+            <w:shd w:val="clear" w:fill="EAF1FD"/>
+          </w:tcPr>
+          <w:p>
+            <w:r/>
+            <w:r>
+              <w:rPr>
+                <w:rFonts w:ascii="Arial" w:hAnsi="Arial"/>
+                <w:b/>
+                <w:color w:val="1F6FEB"/>
+                <w:sz w:val="18"/>
+              </w:rPr>
+              <w:t>728–757</w:t>
+            </w:r>
+          </w:p>
+        </w:tc>
+      </w:tr>
+      <w:tr>
+        <w:tc>
+          <w:tcPr>
+            <w:tcW w:type="dxa" w:w="1656"/>
           </w:tcPr>
           <w:p>
             <w:r/>
@@ -3763,7 +4409,7 @@
                 <w:color w:val="161B26"/>
                 <w:sz w:val="18"/>
               </w:rPr>
-              <w:t>1:20 – 3:30</w:t>
+              <w:t>2:05 – 4:00</w:t>
             </w:r>
           </w:p>
         </w:tc>
@@ -3779,7 +4425,7 @@
                 <w:color w:val="161B26"/>
                 <w:sz w:val="18"/>
               </w:rPr>
-              <w:t>Lab 23: Log Analysis for Incident Response; Lab 24: Containment with Host Isolation</w:t>
+              <w:t>Lab 20: Cyber Kill Chain and ATT&amp;CK Mapping; Lab 21: Evidence Acquisition and Chain of Custody; Lab 22: Memory Forensics with Volatility</w:t>
             </w:r>
           </w:p>
         </w:tc>
@@ -3795,7 +4441,7 @@
                 <w:color w:val="161B26"/>
                 <w:sz w:val="18"/>
               </w:rPr>
-              <w:t>130 min</w:t>
+              <w:t>115 min</w:t>
             </w:r>
           </w:p>
         </w:tc>
@@ -3811,7 +4457,7 @@
                 <w:color w:val="161B26"/>
                 <w:sz w:val="18"/>
               </w:rPr>
-              <w:t>130–138</w:t>
+              <w:t>728–742</w:t>
             </w:r>
           </w:p>
         </w:tc>
@@ -3831,7 +4477,7 @@
                 <w:color w:val="5B6372"/>
                 <w:sz w:val="18"/>
               </w:rPr>
-              <w:t>3:30 – 3:45</w:t>
+              <w:t>4:00 – 4:15</w:t>
             </w:r>
           </w:p>
         </w:tc>
@@ -3903,7 +4549,7 @@
                 <w:color w:val="161B26"/>
                 <w:sz w:val="18"/>
               </w:rPr>
-              <w:t>3:45 – 6:00</w:t>
+              <w:t>4:15 – 6:25</w:t>
             </w:r>
           </w:p>
         </w:tc>
@@ -3919,7 +4565,7 @@
                 <w:color w:val="161B26"/>
                 <w:sz w:val="18"/>
               </w:rPr>
-              <w:t>Lab 25: Incident Response Playbook and Tabletop</w:t>
+              <w:t>Lab 23: Log Analysis for Incident Response; Lab 24: Containment with Host Isolation; Lab 25: Incident Response Playbook and Tabletop</w:t>
             </w:r>
           </w:p>
         </w:tc>
@@ -3935,7 +4581,7 @@
                 <w:color w:val="161B26"/>
                 <w:sz w:val="18"/>
               </w:rPr>
-              <w:t>135 min</w:t>
+              <w:t>130 min</w:t>
             </w:r>
           </w:p>
         </w:tc>
@@ -3951,7 +4597,7 @@
                 <w:color w:val="161B26"/>
                 <w:sz w:val="18"/>
               </w:rPr>
-              <w:t>139–143</w:t>
+              <w:t>743–757</w:t>
             </w:r>
           </w:p>
         </w:tc>
@@ -3969,7 +4615,73 @@
                 <w:color w:val="161B26"/>
                 <w:sz w:val="18"/>
               </w:rPr>
-              <w:t>6:00</w:t>
+              <w:t>6:25 – 6:30</w:t>
+            </w:r>
+          </w:p>
+        </w:tc>
+        <w:tc>
+          <w:tcPr>
+            <w:tcW w:type="dxa" w:w="5040"/>
+          </w:tcPr>
+          <w:p>
+            <w:r/>
+            <w:r>
+              <w:rPr>
+                <w:rFonts w:ascii="Arial" w:hAnsi="Arial"/>
+                <w:color w:val="161B26"/>
+                <w:sz w:val="18"/>
+              </w:rPr>
+              <w:t>Day 3 Recap; Q&amp;A</w:t>
+            </w:r>
+          </w:p>
+        </w:tc>
+        <w:tc>
+          <w:tcPr>
+            <w:tcW w:type="dxa" w:w="1224"/>
+          </w:tcPr>
+          <w:p>
+            <w:r/>
+            <w:r>
+              <w:rPr>
+                <w:rFonts w:ascii="Arial" w:hAnsi="Arial"/>
+                <w:color w:val="161B26"/>
+                <w:sz w:val="18"/>
+              </w:rPr>
+              <w:t>5 min</w:t>
+            </w:r>
+          </w:p>
+        </w:tc>
+        <w:tc>
+          <w:tcPr>
+            <w:tcW w:type="dxa" w:w="1296"/>
+          </w:tcPr>
+          <w:p>
+            <w:r/>
+            <w:r>
+              <w:rPr>
+                <w:rFonts w:ascii="Arial" w:hAnsi="Arial"/>
+                <w:color w:val="161B26"/>
+                <w:sz w:val="18"/>
+              </w:rPr>
+              <w:t>752–757</w:t>
+            </w:r>
+          </w:p>
+        </w:tc>
+      </w:tr>
+      <w:tr>
+        <w:tc>
+          <w:tcPr>
+            <w:tcW w:type="dxa" w:w="1656"/>
+          </w:tcPr>
+          <w:p>
+            <w:r/>
+            <w:r>
+              <w:rPr>
+                <w:rFonts w:ascii="Arial" w:hAnsi="Arial"/>
+                <w:color w:val="161B26"/>
+                <w:sz w:val="18"/>
+              </w:rPr>
+              <w:t>6:30</w:t>
             </w:r>
           </w:p>
         </w:tc>
@@ -4054,7 +4766,7 @@
           <w:b w:val="0"/>
           <w:i/>
           <w:color w:val="5B6372"/>
-          <w:sz w:val="21"/>
+          <w:sz w:val="22"/>
         </w:rPr>
         <w:t>Topic 4: Reporting and Communication</w:t>
       </w:r>
@@ -4069,9 +4781,9 @@
           <w:b/>
           <w:i w:val="0"/>
           <w:color w:val="1F6FEB"/>
-          <w:sz w:val="21"/>
+          <w:sz w:val="22"/>
         </w:rPr>
-        <w:t>Morning Session  ·  9:00 AM – 12:30 PM</w:t>
+        <w:t>Morning Session  ·  9:30 AM – 1:00 PM</w:t>
       </w:r>
     </w:p>
     <w:tbl>
@@ -4173,7 +4885,7 @@
                 <w:color w:val="161B26"/>
                 <w:sz w:val="18"/>
               </w:rPr>
-              <w:t>9:00 – 9:10</w:t>
+              <w:t>9:30 – 9:40</w:t>
             </w:r>
           </w:p>
         </w:tc>
@@ -4294,7 +5006,7 @@
                 <w:color w:val="1F6FEB"/>
                 <w:sz w:val="18"/>
               </w:rPr>
-              <w:t>144–145</w:t>
+              <w:t>758–759</w:t>
             </w:r>
           </w:p>
         </w:tc>
@@ -4312,7 +5024,7 @@
                 <w:color w:val="161B26"/>
                 <w:sz w:val="18"/>
               </w:rPr>
-              <w:t>9:10 – 10:30</w:t>
+              <w:t>9:40 – 10:45</w:t>
             </w:r>
           </w:p>
         </w:tc>
@@ -4328,7 +5040,7 @@
                 <w:color w:val="161B26"/>
                 <w:sz w:val="18"/>
               </w:rPr>
-              <w:t>Lab 26: Vulnerability Management Report; Lab 27: Executive Incident Report</w:t>
+              <w:t>Theory: Reporting and Communication concepts (part 1)</w:t>
             </w:r>
           </w:p>
         </w:tc>
@@ -4344,7 +5056,7 @@
                 <w:color w:val="161B26"/>
                 <w:sz w:val="18"/>
               </w:rPr>
-              <w:t>80 min</w:t>
+              <w:t>65 min</w:t>
             </w:r>
           </w:p>
         </w:tc>
@@ -4360,7 +5072,7 @@
                 <w:color w:val="161B26"/>
                 <w:sz w:val="18"/>
               </w:rPr>
-              <w:t>146–152</w:t>
+              <w:t>760–815</w:t>
             </w:r>
           </w:p>
         </w:tc>
@@ -4380,7 +5092,7 @@
                 <w:color w:val="5B6372"/>
                 <w:sz w:val="18"/>
               </w:rPr>
-              <w:t>10:30 – 10:45</w:t>
+              <w:t>10:45 – 11:00</w:t>
             </w:r>
           </w:p>
         </w:tc>
@@ -4452,7 +5164,7 @@
                 <w:color w:val="161B26"/>
                 <w:sz w:val="18"/>
               </w:rPr>
-              <w:t>10:45 – 12:30</w:t>
+              <w:t>11:00 – 1:00</w:t>
             </w:r>
           </w:p>
         </w:tc>
@@ -4468,7 +5180,7 @@
                 <w:color w:val="161B26"/>
                 <w:sz w:val="18"/>
               </w:rPr>
-              <w:t>Lab 28: Security Metrics Dashboard (MTTD / MTTR)</w:t>
+              <w:t>Theory: Reporting and Communication concepts (part 2)</w:t>
             </w:r>
           </w:p>
         </w:tc>
@@ -4484,7 +5196,7 @@
                 <w:color w:val="161B26"/>
                 <w:sz w:val="18"/>
               </w:rPr>
-              <w:t>105 min</w:t>
+              <w:t>120 min</w:t>
             </w:r>
           </w:p>
         </w:tc>
@@ -4500,7 +5212,7 @@
                 <w:color w:val="161B26"/>
                 <w:sz w:val="18"/>
               </w:rPr>
-              <w:t>153–156</w:t>
+              <w:t>816–870</w:t>
             </w:r>
           </w:p>
         </w:tc>
@@ -4520,7 +5232,7 @@
                 <w:color w:val="5B6372"/>
                 <w:sz w:val="18"/>
               </w:rPr>
-              <w:t>12:30 – 1:15</w:t>
+              <w:t>1:00 – 2:00</w:t>
             </w:r>
           </w:p>
         </w:tc>
@@ -4556,7 +5268,7 @@
                 <w:color w:val="5B6372"/>
                 <w:sz w:val="18"/>
               </w:rPr>
-              <w:t>45 min</w:t>
+              <w:t>60 min</w:t>
             </w:r>
           </w:p>
         </w:tc>
@@ -4595,9 +5307,9 @@
           <w:b/>
           <w:i w:val="0"/>
           <w:color w:val="1F6FEB"/>
-          <w:sz w:val="21"/>
+          <w:sz w:val="22"/>
         </w:rPr>
-        <w:t>Afternoon Session  ·  1:15 PM – 6:00 PM</w:t>
+        <w:t>Afternoon Session  ·  2:00 PM – 6:30 PM</w:t>
       </w:r>
     </w:p>
     <w:tbl>
@@ -4699,7 +5411,7 @@
                 <w:color w:val="161B26"/>
                 <w:sz w:val="18"/>
               </w:rPr>
-              <w:t>1:15 – 1:20</w:t>
+              <w:t>2:00 – 2:05</w:t>
             </w:r>
           </w:p>
         </w:tc>
@@ -4756,6 +5468,79 @@
         <w:tc>
           <w:tcPr>
             <w:tcW w:type="dxa" w:w="1656"/>
+            <w:shd w:val="clear" w:fill="EAF1FD"/>
+          </w:tcPr>
+          <w:p>
+            <w:r/>
+            <w:r>
+              <w:rPr>
+                <w:rFonts w:ascii="Arial" w:hAnsi="Arial"/>
+                <w:b/>
+                <w:color w:val="1F6FEB"/>
+                <w:sz w:val="18"/>
+              </w:rPr>
+            </w:r>
+          </w:p>
+        </w:tc>
+        <w:tc>
+          <w:tcPr>
+            <w:tcW w:type="dxa" w:w="5040"/>
+            <w:shd w:val="clear" w:fill="EAF1FD"/>
+          </w:tcPr>
+          <w:p>
+            <w:r/>
+            <w:r>
+              <w:rPr>
+                <w:rFonts w:ascii="Arial" w:hAnsi="Arial"/>
+                <w:b/>
+                <w:color w:val="1F6FEB"/>
+                <w:sz w:val="18"/>
+              </w:rPr>
+              <w:t>Hands-On Labs 26–30</w:t>
+            </w:r>
+          </w:p>
+        </w:tc>
+        <w:tc>
+          <w:tcPr>
+            <w:tcW w:type="dxa" w:w="1224"/>
+            <w:shd w:val="clear" w:fill="EAF1FD"/>
+          </w:tcPr>
+          <w:p>
+            <w:r/>
+            <w:r>
+              <w:rPr>
+                <w:rFonts w:ascii="Arial" w:hAnsi="Arial"/>
+                <w:b/>
+                <w:color w:val="1F6FEB"/>
+                <w:sz w:val="18"/>
+              </w:rPr>
+              <w:t>—</w:t>
+            </w:r>
+          </w:p>
+        </w:tc>
+        <w:tc>
+          <w:tcPr>
+            <w:tcW w:type="dxa" w:w="1296"/>
+            <w:shd w:val="clear" w:fill="EAF1FD"/>
+          </w:tcPr>
+          <w:p>
+            <w:r/>
+            <w:r>
+              <w:rPr>
+                <w:rFonts w:ascii="Arial" w:hAnsi="Arial"/>
+                <w:b/>
+                <w:color w:val="1F6FEB"/>
+                <w:sz w:val="18"/>
+              </w:rPr>
+              <w:t>871–889</w:t>
+            </w:r>
+          </w:p>
+        </w:tc>
+      </w:tr>
+      <w:tr>
+        <w:tc>
+          <w:tcPr>
+            <w:tcW w:type="dxa" w:w="1656"/>
           </w:tcPr>
           <w:p>
             <w:r/>
@@ -4765,7 +5550,7 @@
                 <w:color w:val="161B26"/>
                 <w:sz w:val="18"/>
               </w:rPr>
-              <w:t>1:20 – 3:30</w:t>
+              <w:t>2:05 – 4:00</w:t>
             </w:r>
           </w:p>
         </w:tc>
@@ -4781,7 +5566,7 @@
                 <w:color w:val="161B26"/>
                 <w:sz w:val="18"/>
               </w:rPr>
-              <w:t>Lab 29: Compliance Reporting (PCI DSS / ISO 27001 / NIST CSF)</w:t>
+              <w:t>Lab 26: Vulnerability Management Report; Lab 27: Executive Incident Report; Lab 28: Security Metrics Dashboard (MTTD / MTTR)</w:t>
             </w:r>
           </w:p>
         </w:tc>
@@ -4797,7 +5582,7 @@
                 <w:color w:val="161B26"/>
                 <w:sz w:val="18"/>
               </w:rPr>
-              <w:t>130 min</w:t>
+              <w:t>115 min</w:t>
             </w:r>
           </w:p>
         </w:tc>
@@ -4813,7 +5598,7 @@
                 <w:color w:val="161B26"/>
                 <w:sz w:val="18"/>
               </w:rPr>
-              <w:t>157–160</w:t>
+              <w:t>871–881</w:t>
             </w:r>
           </w:p>
         </w:tc>
@@ -4833,7 +5618,7 @@
                 <w:color w:val="5B6372"/>
                 <w:sz w:val="18"/>
               </w:rPr>
-              <w:t>3:30 – 3:45</w:t>
+              <w:t>4:00 – 4:15</w:t>
             </w:r>
           </w:p>
         </w:tc>
@@ -4905,7 +5690,7 @@
                 <w:color w:val="161B26"/>
                 <w:sz w:val="18"/>
               </w:rPr>
-              <w:t>3:45 – 6:00</w:t>
+              <w:t>4:15 – 6:25</w:t>
             </w:r>
           </w:p>
         </w:tc>
@@ -4921,7 +5706,7 @@
                 <w:color w:val="161B26"/>
                 <w:sz w:val="18"/>
               </w:rPr>
-              <w:t>Lab 30: Stakeholder Communication and Lessons Learned</w:t>
+              <w:t>Lab 29: Compliance Reporting (PCI DSS / ISO 27001 / NIST CSF); Lab 30: Stakeholder Communication and Lessons Learned</w:t>
             </w:r>
           </w:p>
         </w:tc>
@@ -4937,7 +5722,7 @@
                 <w:color w:val="161B26"/>
                 <w:sz w:val="18"/>
               </w:rPr>
-              <w:t>135 min</w:t>
+              <w:t>130 min</w:t>
             </w:r>
           </w:p>
         </w:tc>
@@ -4953,7 +5738,7 @@
                 <w:color w:val="161B26"/>
                 <w:sz w:val="18"/>
               </w:rPr>
-              <w:t>161–164</w:t>
+              <w:t>882–889</w:t>
             </w:r>
           </w:p>
         </w:tc>
@@ -4971,7 +5756,73 @@
                 <w:color w:val="161B26"/>
                 <w:sz w:val="18"/>
               </w:rPr>
-              <w:t>6:00</w:t>
+              <w:t>6:25 – 6:30</w:t>
+            </w:r>
+          </w:p>
+        </w:tc>
+        <w:tc>
+          <w:tcPr>
+            <w:tcW w:type="dxa" w:w="5040"/>
+          </w:tcPr>
+          <w:p>
+            <w:r/>
+            <w:r>
+              <w:rPr>
+                <w:rFonts w:ascii="Arial" w:hAnsi="Arial"/>
+                <w:color w:val="161B26"/>
+                <w:sz w:val="18"/>
+              </w:rPr>
+              <w:t>Day 4 Recap; Q&amp;A</w:t>
+            </w:r>
+          </w:p>
+        </w:tc>
+        <w:tc>
+          <w:tcPr>
+            <w:tcW w:type="dxa" w:w="1224"/>
+          </w:tcPr>
+          <w:p>
+            <w:r/>
+            <w:r>
+              <w:rPr>
+                <w:rFonts w:ascii="Arial" w:hAnsi="Arial"/>
+                <w:color w:val="161B26"/>
+                <w:sz w:val="18"/>
+              </w:rPr>
+              <w:t>5 min</w:t>
+            </w:r>
+          </w:p>
+        </w:tc>
+        <w:tc>
+          <w:tcPr>
+            <w:tcW w:type="dxa" w:w="1296"/>
+          </w:tcPr>
+          <w:p>
+            <w:r/>
+            <w:r>
+              <w:rPr>
+                <w:rFonts w:ascii="Arial" w:hAnsi="Arial"/>
+                <w:color w:val="161B26"/>
+                <w:sz w:val="18"/>
+              </w:rPr>
+              <w:t>886–889</w:t>
+            </w:r>
+          </w:p>
+        </w:tc>
+      </w:tr>
+      <w:tr>
+        <w:tc>
+          <w:tcPr>
+            <w:tcW w:type="dxa" w:w="1656"/>
+          </w:tcPr>
+          <w:p>
+            <w:r/>
+            <w:r>
+              <w:rPr>
+                <w:rFonts w:ascii="Arial" w:hAnsi="Arial"/>
+                <w:color w:val="161B26"/>
+                <w:sz w:val="18"/>
+              </w:rPr>
+              <w:t>6:30</w:t>
             </w:r>
           </w:p>
         </w:tc>
@@ -5056,9 +5907,9 @@
           <w:b w:val="0"/>
           <w:i/>
           <w:color w:val="5B6372"/>
-          <w:sz w:val="21"/>
+          <w:sz w:val="22"/>
         </w:rPr>
-        <w:t>Revision and Final Assessment</w:t>
+        <w:t>Revision, Practice Exam and Final Assessment</w:t>
       </w:r>
     </w:p>
     <w:p>
@@ -5071,9 +5922,9 @@
           <w:b/>
           <w:i w:val="0"/>
           <w:color w:val="1F6FEB"/>
-          <w:sz w:val="21"/>
+          <w:sz w:val="22"/>
         </w:rPr>
-        <w:t>Morning Session  ·  9:00 AM – 12:30 PM</w:t>
+        <w:t>Morning Session  ·  9:30 AM – 1:00 PM</w:t>
       </w:r>
     </w:p>
     <w:tbl>
@@ -5175,7 +6026,7 @@
                 <w:color w:val="161B26"/>
                 <w:sz w:val="18"/>
               </w:rPr>
-              <w:t>9:00 – 9:10</w:t>
+              <w:t>9:30 – 9:40</w:t>
             </w:r>
           </w:p>
         </w:tc>
@@ -5241,7 +6092,7 @@
                 <w:color w:val="161B26"/>
                 <w:sz w:val="18"/>
               </w:rPr>
-              <w:t>9:10 – 10:30</w:t>
+              <w:t>9:40 – 10:45</w:t>
             </w:r>
           </w:p>
         </w:tc>
@@ -5273,7 +6124,7 @@
                 <w:color w:val="161B26"/>
                 <w:sz w:val="18"/>
               </w:rPr>
-              <w:t>80 min</w:t>
+              <w:t>65 min</w:t>
             </w:r>
           </w:p>
         </w:tc>
@@ -5289,7 +6140,7 @@
                 <w:color w:val="161B26"/>
                 <w:sz w:val="18"/>
               </w:rPr>
-              <w:t>25–70, 73–112</w:t>
+              <w:t>24–316, 317–626</w:t>
             </w:r>
           </w:p>
         </w:tc>
@@ -5309,7 +6160,7 @@
                 <w:color w:val="5B6372"/>
                 <w:sz w:val="18"/>
               </w:rPr>
-              <w:t>10:30 – 10:45</w:t>
+              <w:t>10:45 – 11:00</w:t>
             </w:r>
           </w:p>
         </w:tc>
@@ -5381,7 +6232,7 @@
                 <w:color w:val="161B26"/>
                 <w:sz w:val="18"/>
               </w:rPr>
-              <w:t>10:45 – 12:30</w:t>
+              <w:t>11:00 – 1:00</w:t>
             </w:r>
           </w:p>
         </w:tc>
@@ -5397,7 +6248,7 @@
                 <w:color w:val="161B26"/>
                 <w:sz w:val="18"/>
               </w:rPr>
-              <w:t>Revision: Topic 3 Incident Response &amp; Topic 4 Reporting; Practice Exams</w:t>
+              <w:t>Revision: Topic 3 Incident Response &amp; Topic 4 Reporting</w:t>
             </w:r>
           </w:p>
         </w:tc>
@@ -5413,7 +6264,7 @@
                 <w:color w:val="161B26"/>
                 <w:sz w:val="18"/>
               </w:rPr>
-              <w:t>105 min</w:t>
+              <w:t>120 min</w:t>
             </w:r>
           </w:p>
         </w:tc>
@@ -5429,7 +6280,7 @@
                 <w:color w:val="161B26"/>
                 <w:sz w:val="18"/>
               </w:rPr>
-              <w:t>115–143, 146–164, 165</w:t>
+              <w:t>627–757, 758–889</w:t>
             </w:r>
           </w:p>
         </w:tc>
@@ -5449,7 +6300,7 @@
                 <w:color w:val="5B6372"/>
                 <w:sz w:val="18"/>
               </w:rPr>
-              <w:t>12:30 – 1:15</w:t>
+              <w:t>1:00 – 2:00</w:t>
             </w:r>
           </w:p>
         </w:tc>
@@ -5485,7 +6336,7 @@
                 <w:color w:val="5B6372"/>
                 <w:sz w:val="18"/>
               </w:rPr>
-              <w:t>45 min</w:t>
+              <w:t>60 min</w:t>
             </w:r>
           </w:p>
         </w:tc>
@@ -5524,9 +6375,9 @@
           <w:b/>
           <w:i w:val="0"/>
           <w:color w:val="1F6FEB"/>
-          <w:sz w:val="21"/>
+          <w:sz w:val="22"/>
         </w:rPr>
-        <w:t>Afternoon Session  ·  1:15 PM – 6:00 PM</w:t>
+        <w:t>Afternoon Session  ·  2:00 PM – 6:30 PM</w:t>
       </w:r>
     </w:p>
     <w:tbl>
@@ -5628,7 +6479,7 @@
                 <w:color w:val="161B26"/>
                 <w:sz w:val="18"/>
               </w:rPr>
-              <w:t>1:15 – 1:20</w:t>
+              <w:t>2:00 – 2:05</w:t>
             </w:r>
           </w:p>
         </w:tc>
@@ -5694,7 +6545,7 @@
                 <w:color w:val="161B26"/>
                 <w:sz w:val="18"/>
               </w:rPr>
-              <w:t>1:20 – 3:30</w:t>
+              <w:t>2:05 – 3:15</w:t>
             </w:r>
           </w:p>
         </w:tc>
@@ -5710,7 +6561,7 @@
                 <w:color w:val="161B26"/>
                 <w:sz w:val="18"/>
               </w:rPr>
-              <w:t>Q&amp;A; Summary; exam techniques; Course Feedback &amp; TRAQOM Survey</w:t>
+              <w:t>Practice Exam (warm-up quiz) and review</w:t>
             </w:r>
           </w:p>
         </w:tc>
@@ -5726,7 +6577,7 @@
                 <w:color w:val="161B26"/>
                 <w:sz w:val="18"/>
               </w:rPr>
-              <w:t>130 min</w:t>
+              <w:t>70 min</w:t>
             </w:r>
           </w:p>
         </w:tc>
@@ -5742,7 +6593,73 @@
                 <w:color w:val="161B26"/>
                 <w:sz w:val="18"/>
               </w:rPr>
-              <w:t>166–168</w:t>
+              <w:t>891–906</w:t>
+            </w:r>
+          </w:p>
+        </w:tc>
+      </w:tr>
+      <w:tr>
+        <w:tc>
+          <w:tcPr>
+            <w:tcW w:type="dxa" w:w="1656"/>
+          </w:tcPr>
+          <w:p>
+            <w:r/>
+            <w:r>
+              <w:rPr>
+                <w:rFonts w:ascii="Arial" w:hAnsi="Arial"/>
+                <w:color w:val="161B26"/>
+                <w:sz w:val="18"/>
+              </w:rPr>
+              <w:t>3:15 – 3:45</w:t>
+            </w:r>
+          </w:p>
+        </w:tc>
+        <w:tc>
+          <w:tcPr>
+            <w:tcW w:type="dxa" w:w="5040"/>
+          </w:tcPr>
+          <w:p>
+            <w:r/>
+            <w:r>
+              <w:rPr>
+                <w:rFonts w:ascii="Arial" w:hAnsi="Arial"/>
+                <w:color w:val="161B26"/>
+                <w:sz w:val="18"/>
+              </w:rPr>
+              <w:t>CompTIA CySA+ exam registration walkthrough (Pearson VUE)</w:t>
+            </w:r>
+          </w:p>
+        </w:tc>
+        <w:tc>
+          <w:tcPr>
+            <w:tcW w:type="dxa" w:w="1224"/>
+          </w:tcPr>
+          <w:p>
+            <w:r/>
+            <w:r>
+              <w:rPr>
+                <w:rFonts w:ascii="Arial" w:hAnsi="Arial"/>
+                <w:color w:val="161B26"/>
+                <w:sz w:val="18"/>
+              </w:rPr>
+              <w:t>30 min</w:t>
+            </w:r>
+          </w:p>
+        </w:tc>
+        <w:tc>
+          <w:tcPr>
+            <w:tcW w:type="dxa" w:w="1296"/>
+          </w:tcPr>
+          <w:p>
+            <w:r/>
+            <w:r>
+              <w:rPr>
+                <w:rFonts w:ascii="Arial" w:hAnsi="Arial"/>
+                <w:color w:val="161B26"/>
+                <w:sz w:val="18"/>
+              </w:rPr>
+              <w:t>907–910</w:t>
             </w:r>
           </w:p>
         </w:tc>
@@ -5762,7 +6679,7 @@
                 <w:color w:val="5B6372"/>
                 <w:sz w:val="18"/>
               </w:rPr>
-              <w:t>3:30 – 3:45</w:t>
+              <w:t>3:45 – 4:00</w:t>
             </w:r>
           </w:p>
         </w:tc>
@@ -5834,7 +6751,7 @@
                 <w:color w:val="161B26"/>
                 <w:sz w:val="18"/>
               </w:rPr>
-              <w:t>3:45 – 4:00</w:t>
+              <w:t>4:00 – 4:15</w:t>
             </w:r>
           </w:p>
         </w:tc>
@@ -5850,7 +6767,7 @@
                 <w:color w:val="161B26"/>
                 <w:sz w:val="18"/>
               </w:rPr>
-              <w:t>Assessment Briefing; Digital Attendance (Assessment)</w:t>
+              <w:t>Course Feedback &amp; TRAQOM Survey; Assessment Briefing; Digital Attendance (Assessment)</w:t>
             </w:r>
           </w:p>
         </w:tc>
@@ -5882,7 +6799,7 @@
                 <w:color w:val="161B26"/>
                 <w:sz w:val="18"/>
               </w:rPr>
-              <w:t>169</w:t>
+              <w:t>911–919</w:t>
             </w:r>
           </w:p>
         </w:tc>
@@ -5900,7 +6817,7 @@
                 <w:color w:val="161B26"/>
                 <w:sz w:val="18"/>
               </w:rPr>
-              <w:t>4:00 – 6:00</w:t>
+              <w:t>4:15 – 6:15</w:t>
             </w:r>
           </w:p>
         </w:tc>
@@ -5966,7 +6883,7 @@
                 <w:color w:val="161B26"/>
                 <w:sz w:val="18"/>
               </w:rPr>
-              <w:t>6:00</w:t>
+              <w:t>6:15 – 6:30</w:t>
             </w:r>
           </w:p>
         </w:tc>
@@ -5982,7 +6899,7 @@
                 <w:color w:val="161B26"/>
                 <w:sz w:val="18"/>
               </w:rPr>
-              <w:t>End of Class; Recommended Courses; Support</w:t>
+              <w:t>Assessment wrap-up; Recommended Courses; Support</w:t>
             </w:r>
           </w:p>
         </w:tc>
@@ -5998,7 +6915,7 @@
                 <w:color w:val="161B26"/>
                 <w:sz w:val="18"/>
               </w:rPr>
-              <w:t>—</w:t>
+              <w:t>15 min</w:t>
             </w:r>
           </w:p>
         </w:tc>
@@ -6014,7 +6931,73 @@
                 <w:color w:val="161B26"/>
                 <w:sz w:val="18"/>
               </w:rPr>
-              <w:t>170–172</w:t>
+              <w:t>—</w:t>
+            </w:r>
+          </w:p>
+        </w:tc>
+      </w:tr>
+      <w:tr>
+        <w:tc>
+          <w:tcPr>
+            <w:tcW w:type="dxa" w:w="1656"/>
+          </w:tcPr>
+          <w:p>
+            <w:r/>
+            <w:r>
+              <w:rPr>
+                <w:rFonts w:ascii="Arial" w:hAnsi="Arial"/>
+                <w:color w:val="161B26"/>
+                <w:sz w:val="18"/>
+              </w:rPr>
+              <w:t>6:30</w:t>
+            </w:r>
+          </w:p>
+        </w:tc>
+        <w:tc>
+          <w:tcPr>
+            <w:tcW w:type="dxa" w:w="5040"/>
+          </w:tcPr>
+          <w:p>
+            <w:r/>
+            <w:r>
+              <w:rPr>
+                <w:rFonts w:ascii="Arial" w:hAnsi="Arial"/>
+                <w:color w:val="161B26"/>
+                <w:sz w:val="18"/>
+              </w:rPr>
+              <w:t>End of Class</w:t>
+            </w:r>
+          </w:p>
+        </w:tc>
+        <w:tc>
+          <w:tcPr>
+            <w:tcW w:type="dxa" w:w="1224"/>
+          </w:tcPr>
+          <w:p>
+            <w:r/>
+            <w:r>
+              <w:rPr>
+                <w:rFonts w:ascii="Arial" w:hAnsi="Arial"/>
+                <w:color w:val="161B26"/>
+                <w:sz w:val="18"/>
+              </w:rPr>
+              <w:t>—</w:t>
+            </w:r>
+          </w:p>
+        </w:tc>
+        <w:tc>
+          <w:tcPr>
+            <w:tcW w:type="dxa" w:w="1296"/>
+          </w:tcPr>
+          <w:p>
+            <w:r/>
+            <w:r>
+              <w:rPr>
+                <w:rFonts w:ascii="Arial" w:hAnsi="Arial"/>
+                <w:color w:val="161B26"/>
+                <w:sz w:val="18"/>
+              </w:rPr>
+              <w:t>—</w:t>
             </w:r>
           </w:p>
         </w:tc>
@@ -6138,7 +7121,7 @@
                 <w:color w:val="161B26"/>
                 <w:sz w:val="19"/>
               </w:rPr>
-              <w:t>Title, Attendance, Ground Rules, Lesson Plan, Skills Framework, Learning Outcomes, Course Outline, Assessment, Funding, LMS</w:t>
+              <w:t>Title, Attendance, Trainer, Ground Rules, Download Material, Lesson Plan, Skills Framework, Learning Outcomes, CS0-003 Exam Domains, Course Outline, Briefing, Assessment, Funding</w:t>
             </w:r>
           </w:p>
         </w:tc>
@@ -6154,7 +7137,7 @@
                 <w:color w:val="161B26"/>
                 <w:sz w:val="19"/>
               </w:rPr>
-              <w:t>1–22</w:t>
+              <w:t>1–23</w:t>
             </w:r>
           </w:p>
         </w:tc>
@@ -6188,7 +7171,7 @@
                 <w:color w:val="161B26"/>
                 <w:sz w:val="19"/>
               </w:rPr>
-              <w:t>Section + Overview + Labs 1–10</w:t>
+              <w:t>Section + Overview + Theory + Labs 1–10 + Recap</w:t>
             </w:r>
           </w:p>
         </w:tc>
@@ -6204,7 +7187,7 @@
                 <w:color w:val="161B26"/>
                 <w:sz w:val="19"/>
               </w:rPr>
-              <w:t>25–70</w:t>
+              <w:t>24–317</w:t>
             </w:r>
           </w:p>
         </w:tc>
@@ -6238,7 +7221,7 @@
                 <w:color w:val="161B26"/>
                 <w:sz w:val="19"/>
               </w:rPr>
-              <w:t>Section + Overview + Labs 11–19</w:t>
+              <w:t>Section + Overview + Theory + Labs 11–19 + Recap</w:t>
             </w:r>
           </w:p>
         </w:tc>
@@ -6254,7 +7237,7 @@
                 <w:color w:val="161B26"/>
                 <w:sz w:val="19"/>
               </w:rPr>
-              <w:t>73–112</w:t>
+              <w:t>317–627</w:t>
             </w:r>
           </w:p>
         </w:tc>
@@ -6288,7 +7271,7 @@
                 <w:color w:val="161B26"/>
                 <w:sz w:val="19"/>
               </w:rPr>
-              <w:t>Section + Overview + Labs 20–25</w:t>
+              <w:t>Section + Overview + Theory + Labs 20–25 + Recap</w:t>
             </w:r>
           </w:p>
         </w:tc>
@@ -6304,7 +7287,7 @@
                 <w:color w:val="161B26"/>
                 <w:sz w:val="19"/>
               </w:rPr>
-              <w:t>115–143</w:t>
+              <w:t>627–758</w:t>
             </w:r>
           </w:p>
         </w:tc>
@@ -6338,7 +7321,7 @@
                 <w:color w:val="161B26"/>
                 <w:sz w:val="19"/>
               </w:rPr>
-              <w:t>Section + Overview + Labs 26–30</w:t>
+              <w:t>Section + Overview + Theory + Labs 26–30 + Recap</w:t>
             </w:r>
           </w:p>
         </w:tc>
@@ -6354,7 +7337,7 @@
                 <w:color w:val="161B26"/>
                 <w:sz w:val="19"/>
               </w:rPr>
-              <w:t>146–164</w:t>
+              <w:t>758–890</w:t>
             </w:r>
           </w:p>
         </w:tc>
@@ -6404,7 +7387,7 @@
                 <w:color w:val="161B26"/>
                 <w:sz w:val="19"/>
               </w:rPr>
-              <w:t>25–29</w:t>
+              <w:t>270–274</w:t>
             </w:r>
           </w:p>
         </w:tc>
@@ -6454,7 +7437,7 @@
                 <w:color w:val="161B26"/>
                 <w:sz w:val="19"/>
               </w:rPr>
-              <w:t>30–33</w:t>
+              <w:t>275–278</w:t>
             </w:r>
           </w:p>
         </w:tc>
@@ -6504,7 +7487,7 @@
                 <w:color w:val="161B26"/>
                 <w:sz w:val="19"/>
               </w:rPr>
-              <w:t>34–38</w:t>
+              <w:t>279–283</w:t>
             </w:r>
           </w:p>
         </w:tc>
@@ -6554,7 +7537,7 @@
                 <w:color w:val="161B26"/>
                 <w:sz w:val="19"/>
               </w:rPr>
-              <w:t>39–42</w:t>
+              <w:t>284–287</w:t>
             </w:r>
           </w:p>
         </w:tc>
@@ -6604,7 +7587,7 @@
                 <w:color w:val="161B26"/>
                 <w:sz w:val="19"/>
               </w:rPr>
-              <w:t>43–47</w:t>
+              <w:t>288–292</w:t>
             </w:r>
           </w:p>
         </w:tc>
@@ -6654,7 +7637,7 @@
                 <w:color w:val="161B26"/>
                 <w:sz w:val="19"/>
               </w:rPr>
-              <w:t>48–52</w:t>
+              <w:t>293–297</w:t>
             </w:r>
           </w:p>
         </w:tc>
@@ -6704,7 +7687,7 @@
                 <w:color w:val="161B26"/>
                 <w:sz w:val="19"/>
               </w:rPr>
-              <w:t>53–56</w:t>
+              <w:t>298–301</w:t>
             </w:r>
           </w:p>
         </w:tc>
@@ -6754,7 +7737,7 @@
                 <w:color w:val="161B26"/>
                 <w:sz w:val="19"/>
               </w:rPr>
-              <w:t>57–60</w:t>
+              <w:t>302–305</w:t>
             </w:r>
           </w:p>
         </w:tc>
@@ -6804,7 +7787,7 @@
                 <w:color w:val="161B26"/>
                 <w:sz w:val="19"/>
               </w:rPr>
-              <w:t>61–65</w:t>
+              <w:t>306–310</w:t>
             </w:r>
           </w:p>
         </w:tc>
@@ -6854,7 +7837,7 @@
                 <w:color w:val="161B26"/>
                 <w:sz w:val="19"/>
               </w:rPr>
-              <w:t>66–70</w:t>
+              <w:t>311–316</w:t>
             </w:r>
           </w:p>
         </w:tc>
@@ -6904,7 +7887,7 @@
                 <w:color w:val="161B26"/>
                 <w:sz w:val="19"/>
               </w:rPr>
-              <w:t>73–77</w:t>
+              <w:t>586–590</w:t>
             </w:r>
           </w:p>
         </w:tc>
@@ -6954,7 +7937,7 @@
                 <w:color w:val="161B26"/>
                 <w:sz w:val="19"/>
               </w:rPr>
-              <w:t>78–82</w:t>
+              <w:t>591–595</w:t>
             </w:r>
           </w:p>
         </w:tc>
@@ -7004,7 +7987,7 @@
                 <w:color w:val="161B26"/>
                 <w:sz w:val="19"/>
               </w:rPr>
-              <w:t>83–86</w:t>
+              <w:t>596–599</w:t>
             </w:r>
           </w:p>
         </w:tc>
@@ -7054,7 +8037,7 @@
                 <w:color w:val="161B26"/>
                 <w:sz w:val="19"/>
               </w:rPr>
-              <w:t>87–90</w:t>
+              <w:t>600–603</w:t>
             </w:r>
           </w:p>
         </w:tc>
@@ -7104,7 +8087,7 @@
                 <w:color w:val="161B26"/>
                 <w:sz w:val="19"/>
               </w:rPr>
-              <w:t>91–95</w:t>
+              <w:t>604–608</w:t>
             </w:r>
           </w:p>
         </w:tc>
@@ -7154,7 +8137,7 @@
                 <w:color w:val="161B26"/>
                 <w:sz w:val="19"/>
               </w:rPr>
-              <w:t>96–99</w:t>
+              <w:t>609–612</w:t>
             </w:r>
           </w:p>
         </w:tc>
@@ -7204,7 +8187,7 @@
                 <w:color w:val="161B26"/>
                 <w:sz w:val="19"/>
               </w:rPr>
-              <w:t>100–104</w:t>
+              <w:t>613–617</w:t>
             </w:r>
           </w:p>
         </w:tc>
@@ -7254,7 +8237,7 @@
                 <w:color w:val="161B26"/>
                 <w:sz w:val="19"/>
               </w:rPr>
-              <w:t>105–108</w:t>
+              <w:t>618–621</w:t>
             </w:r>
           </w:p>
         </w:tc>
@@ -7304,7 +8287,7 @@
                 <w:color w:val="161B26"/>
                 <w:sz w:val="19"/>
               </w:rPr>
-              <w:t>109–112</w:t>
+              <w:t>622–626</w:t>
             </w:r>
           </w:p>
         </w:tc>
@@ -7354,7 +8337,7 @@
                 <w:color w:val="161B26"/>
                 <w:sz w:val="19"/>
               </w:rPr>
-              <w:t>115–119</w:t>
+              <w:t>728–732</w:t>
             </w:r>
           </w:p>
         </w:tc>
@@ -7404,7 +8387,7 @@
                 <w:color w:val="161B26"/>
                 <w:sz w:val="19"/>
               </w:rPr>
-              <w:t>120–124</w:t>
+              <w:t>733–737</w:t>
             </w:r>
           </w:p>
         </w:tc>
@@ -7454,7 +8437,7 @@
                 <w:color w:val="161B26"/>
                 <w:sz w:val="19"/>
               </w:rPr>
-              <w:t>125–129</w:t>
+              <w:t>738–742</w:t>
             </w:r>
           </w:p>
         </w:tc>
@@ -7504,7 +8487,7 @@
                 <w:color w:val="161B26"/>
                 <w:sz w:val="19"/>
               </w:rPr>
-              <w:t>130–134</w:t>
+              <w:t>743–747</w:t>
             </w:r>
           </w:p>
         </w:tc>
@@ -7554,7 +8537,7 @@
                 <w:color w:val="161B26"/>
                 <w:sz w:val="19"/>
               </w:rPr>
-              <w:t>135–138</w:t>
+              <w:t>748–751</w:t>
             </w:r>
           </w:p>
         </w:tc>
@@ -7604,7 +8587,7 @@
                 <w:color w:val="161B26"/>
                 <w:sz w:val="19"/>
               </w:rPr>
-              <w:t>139–143</w:t>
+              <w:t>752–757</w:t>
             </w:r>
           </w:p>
         </w:tc>
@@ -7654,7 +8637,7 @@
                 <w:color w:val="161B26"/>
                 <w:sz w:val="19"/>
               </w:rPr>
-              <w:t>146–149</w:t>
+              <w:t>871–874</w:t>
             </w:r>
           </w:p>
         </w:tc>
@@ -7704,7 +8687,7 @@
                 <w:color w:val="161B26"/>
                 <w:sz w:val="19"/>
               </w:rPr>
-              <w:t>150–152</w:t>
+              <w:t>875–877</w:t>
             </w:r>
           </w:p>
         </w:tc>
@@ -7754,7 +8737,7 @@
                 <w:color w:val="161B26"/>
                 <w:sz w:val="19"/>
               </w:rPr>
-              <w:t>153–156</w:t>
+              <w:t>878–881</w:t>
             </w:r>
           </w:p>
         </w:tc>
@@ -7804,7 +8787,7 @@
                 <w:color w:val="161B26"/>
                 <w:sz w:val="19"/>
               </w:rPr>
-              <w:t>157–160</w:t>
+              <w:t>882–885</w:t>
             </w:r>
           </w:p>
         </w:tc>
@@ -7854,7 +8837,7 @@
                 <w:color w:val="161B26"/>
                 <w:sz w:val="19"/>
               </w:rPr>
-              <w:t>161–164</w:t>
+              <w:t>886–889</w:t>
             </w:r>
           </w:p>
         </w:tc>
@@ -7872,7 +8855,7 @@
                 <w:color w:val="161B26"/>
                 <w:sz w:val="19"/>
               </w:rPr>
-              <w:t>Back Admin</w:t>
+              <w:t>Practice Exam</w:t>
             </w:r>
           </w:p>
         </w:tc>
@@ -7888,7 +8871,7 @@
                 <w:color w:val="161B26"/>
                 <w:sz w:val="19"/>
               </w:rPr>
-              <w:t>Practice Exams, Summary/Q&amp;A, TRAQOM, Attendance, Final Assessment, Recommended Courses, Support, Thank You</w:t>
+              <w:t>Practice section, warm-up quiz and answer key</w:t>
             </w:r>
           </w:p>
         </w:tc>
@@ -7904,7 +8887,107 @@
                 <w:color w:val="161B26"/>
                 <w:sz w:val="19"/>
               </w:rPr>
-              <w:t>165–172</w:t>
+              <w:t>891–906</w:t>
+            </w:r>
+          </w:p>
+        </w:tc>
+      </w:tr>
+      <w:tr>
+        <w:tc>
+          <w:tcPr>
+            <w:tcW w:type="dxa" w:w="2736"/>
+          </w:tcPr>
+          <w:p>
+            <w:r/>
+            <w:r>
+              <w:rPr>
+                <w:rFonts w:ascii="Arial" w:hAnsi="Arial"/>
+                <w:color w:val="161B26"/>
+                <w:sz w:val="19"/>
+              </w:rPr>
+              <w:t>Exam Registration</w:t>
+            </w:r>
+          </w:p>
+        </w:tc>
+        <w:tc>
+          <w:tcPr>
+            <w:tcW w:type="dxa" w:w="5616"/>
+          </w:tcPr>
+          <w:p>
+            <w:r/>
+            <w:r>
+              <w:rPr>
+                <w:rFonts w:ascii="Arial" w:hAnsi="Arial"/>
+                <w:color w:val="161B26"/>
+                <w:sz w:val="19"/>
+              </w:rPr>
+              <w:t>CompTIA CySA+ exam facts and Pearson VUE registration steps</w:t>
+            </w:r>
+          </w:p>
+        </w:tc>
+        <w:tc>
+          <w:tcPr>
+            <w:tcW w:type="dxa" w:w="1296"/>
+          </w:tcPr>
+          <w:p>
+            <w:r/>
+            <w:r>
+              <w:rPr>
+                <w:rFonts w:ascii="Arial" w:hAnsi="Arial"/>
+                <w:color w:val="161B26"/>
+                <w:sz w:val="19"/>
+              </w:rPr>
+              <w:t>907–910</w:t>
+            </w:r>
+          </w:p>
+        </w:tc>
+      </w:tr>
+      <w:tr>
+        <w:tc>
+          <w:tcPr>
+            <w:tcW w:type="dxa" w:w="2736"/>
+          </w:tcPr>
+          <w:p>
+            <w:r/>
+            <w:r>
+              <w:rPr>
+                <w:rFonts w:ascii="Arial" w:hAnsi="Arial"/>
+                <w:color w:val="161B26"/>
+                <w:sz w:val="19"/>
+              </w:rPr>
+              <w:t>Back Admin (Wrap-Up)</w:t>
+            </w:r>
+          </w:p>
+        </w:tc>
+        <w:tc>
+          <w:tcPr>
+            <w:tcW w:type="dxa" w:w="5616"/>
+          </w:tcPr>
+          <w:p>
+            <w:r/>
+            <w:r>
+              <w:rPr>
+                <w:rFonts w:ascii="Arial" w:hAnsi="Arial"/>
+                <w:color w:val="161B26"/>
+                <w:sz w:val="19"/>
+              </w:rPr>
+              <w:t>Summary, TRAQOM, Attendance, Assessment, Assessment Flow, Recommended Courses, Support, Thank You</w:t>
+            </w:r>
+          </w:p>
+        </w:tc>
+        <w:tc>
+          <w:tcPr>
+            <w:tcW w:type="dxa" w:w="1296"/>
+          </w:tcPr>
+          <w:p>
+            <w:r/>
+            <w:r>
+              <w:rPr>
+                <w:rFonts w:ascii="Arial" w:hAnsi="Arial"/>
+                <w:color w:val="161B26"/>
+                <w:sz w:val="19"/>
+              </w:rPr>
+              <w:t>911–919</w:t>
             </w:r>
           </w:p>
         </w:tc>
@@ -8350,7 +9433,7 @@
     <w:rPr>
       <w:rFonts w:ascii="Arial" w:hAnsi="Arial"/>
       <w:color w:val="161B26"/>
-      <w:sz w:val="21"/>
+      <w:sz w:val="22"/>
     </w:rPr>
   </w:style>
   <w:style w:type="paragraph" w:styleId="Header">

</xml_diff>